<commit_message>
Refine CVE wording and report styles after QA review
- docs: state CVE-2026-93546 impact as C:H/I:H/A:H to match the NVD 8.8
  vector (worker crash + property-DB corruption is the demonstrable effect);
  drop the unsubstantiated fix-revision number, keep "fixed in 2.4.69"
- lab: note the digest realm must match between AuthName and DIGEST_REALM;
  align backend docstring with the python:3.12-slim base image
- report: customise built-in heading styles (remove duplicate style IDs);
  validated OOXML, Calibri 11pt body preserved
</commit_message>
<xml_diff>
--- a/report/Report_PX-YY_SKELETON.docx
+++ b/report/Report_PX-YY_SKELETON.docx
@@ -2150,10 +2150,16 @@
     <w:basedOn w:val="Normal"/>
     <w:next w:val="Normal"/>
     <w:qFormat/>
+    <w:pPr>
+      <w:spacing w:after="120" w:before="240"/>
+    </w:pPr>
     <w:rPr>
-      <w:color w:val="2E74B5"/>
-      <w:sz w:val="32"/>
-      <w:szCs w:val="32"/>
+      <w:rFonts w:ascii="Calibri" w:cs="Calibri" w:eastAsia="Calibri" w:hAnsi="Calibri"/>
+      <w:b/>
+      <w:bCs/>
+      <w:color w:val="2F5496"/>
+      <w:sz w:val="28"/>
+      <w:szCs w:val="28"/>
     </w:rPr>
   </w:style>
   <w:style w:type="paragraph" w:styleId="Heading2">
@@ -2161,10 +2167,16 @@
     <w:basedOn w:val="Normal"/>
     <w:next w:val="Normal"/>
     <w:qFormat/>
+    <w:pPr>
+      <w:spacing w:after="80" w:before="160"/>
+    </w:pPr>
     <w:rPr>
-      <w:color w:val="2E74B5"/>
-      <w:sz w:val="26"/>
-      <w:szCs w:val="26"/>
+      <w:rFonts w:ascii="Calibri" w:cs="Calibri" w:eastAsia="Calibri" w:hAnsi="Calibri"/>
+      <w:b/>
+      <w:bCs/>
+      <w:color w:val="2F5496"/>
+      <w:sz w:val="24"/>
+      <w:szCs w:val="24"/>
     </w:rPr>
   </w:style>
   <w:style w:type="paragraph" w:styleId="Heading3">
@@ -2306,41 +2318,5 @@
       <w:szCs w:val="20"/>
     </w:rPr>
   </w:style>
-  <w:style w:type="paragraph" w:styleId="Heading1">
-    <w:name w:val="Heading 1"/>
-    <w:basedOn w:val="Normal"/>
-    <w:next w:val="Normal"/>
-    <w:qFormat/>
-    <w:pPr>
-      <w:spacing w:after="120" w:before="240"/>
-      <w:outlineLvl w:val="0"/>
-    </w:pPr>
-    <w:rPr>
-      <w:rFonts w:ascii="Calibri" w:cs="Calibri" w:eastAsia="Calibri" w:hAnsi="Calibri"/>
-      <w:b/>
-      <w:bCs/>
-      <w:color w:val="2F5496"/>
-      <w:sz w:val="28"/>
-      <w:szCs w:val="28"/>
-    </w:rPr>
-  </w:style>
-  <w:style w:type="paragraph" w:styleId="Heading2">
-    <w:name w:val="Heading 2"/>
-    <w:basedOn w:val="Normal"/>
-    <w:next w:val="Normal"/>
-    <w:qFormat/>
-    <w:pPr>
-      <w:spacing w:after="80" w:before="160"/>
-      <w:outlineLvl w:val="1"/>
-    </w:pPr>
-    <w:rPr>
-      <w:rFonts w:ascii="Calibri" w:cs="Calibri" w:eastAsia="Calibri" w:hAnsi="Calibri"/>
-      <w:b/>
-      <w:bCs/>
-      <w:color w:val="2F5496"/>
-      <w:sz w:val="24"/>
-      <w:szCs w:val="24"/>
-    </w:rPr>
-  </w:style>
 </w:styles>
 </file>
</xml_diff>